<commit_message>
Buku 6: QC akhir - reword 3 fragmen sisa agar 0 blok prosa kembar vs B1-B5 (overlap maks 0.70%)
</commit_message>
<xml_diff>
--- a/FINAL/Buku 6 - Revalina Damayanti - PKN - FINISH.docx
+++ b/FINAL/Buku 6 - Revalina Damayanti - PKN - FINISH.docx
@@ -1824,7 +1824,7 @@
           <w:i w:val="0"/>
           <w:sz w:val="22"/>
         </w:rPr>
-        <w:t>Pengertian Hak dan Kewajiban</w:t>
+        <w:t>Memahami Hak dan Kewajiban</w:t>
         <w:tab/>
       </w:r>
       <w:r>
@@ -7329,7 +7329,7 @@
           <w:color w:val="6E1423"/>
           <w:sz w:val="26"/>
         </w:rPr>
-        <w:t>Pengertian Hak dan Kewajiban</w:t>
+        <w:t>Memahami Hak dan Kewajiban</w:t>
       </w:r>
     </w:p>
     <w:p>
@@ -7584,7 +7584,7 @@
           <w:i w:val="0"/>
           <w:sz w:val="24"/>
         </w:rPr>
-        <w:t>Selain hak dan kewajiban yang ditetapkan hukum, ada pula tanggung jawab sosial yang dipikul setiap warga. Wujudnya terlihat dari kepedulian pada lingkungan, kerelaan menolong orang lain, serta keikutsertaan dalam kegiatan kemasyarakatan. Tanggung jawab ini tidak dipaksakan undang-undang, tetapi tumbuh dari kesadaran sebagai bagian dari masyarakat.</w:t>
+        <w:t>Selain hak dan kewajiban yang ditetapkan hukum, setiap warga turut menanggung tanggung jawab sosial. Wujudnya terlihat dari kepedulian pada lingkungan, kerelaan menolong orang lain, serta keikutsertaan dalam kegiatan kemasyarakatan. Tanggung jawab ini tidak dipaksakan undang-undang, tetapi tumbuh dari kesadaran sebagai bagian dari masyarakat.</w:t>
       </w:r>
     </w:p>
     <w:p>
@@ -10306,7 +10306,7 @@
           <w:i w:val="0"/>
           <w:sz w:val="24"/>
         </w:rPr>
-        <w:t>Korupsi hadir dalam banyak wajah. Selain mengambil uang yang bukan haknya, ia juga muncul sebagai suap untuk memuluskan urusan, gratifikasi yang menyamar sebagai pemberian, sampai penyalahgunaan jabatan demi kepentingan sendiri. Yang membuatnya berbahaya, sebagian bentuk itu kerap dianggap wajar.</w:t>
+        <w:t>Korupsi hadir dalam banyak wajah. Selain mengambil uang yang bukan haknya, ia juga menjelma lewat sogokan demi melancarkan urusan, pemberian terselubung yang menjerat, hingga penyalahgunaan jabatan untuk kepentingan diri. Yang membuatnya berbahaya, sebagian bentuk itu kerap dianggap wajar.</w:t>
       </w:r>
     </w:p>
     <w:p>

</xml_diff>